<commit_message>
docs: added docs and checklist for phase 3
</commit_message>
<xml_diff>
--- a/docs/IT342_Phase3_BidWarsOnline_Sanchez.docx
+++ b/docs/IT342_Phase3_BidWarsOnline_Sanchez.docx
@@ -169,12 +169,12 @@
       <w:r>
         <w:t xml:space="preserve"> </w:t>
       </w:r>
-      <w:hyperlink r:id="rId6" w:tgtFrame="_blank" w:history="1">
+      <w:hyperlink r:id="rId6" w:history="1">
         <w:r>
           <w:rPr>
             <w:rStyle w:val="Hyperlink"/>
           </w:rPr>
-          <w:t>61a45e22e0194061a1b71969e22d95a1b936cbb2</w:t>
+          <w:t>https://github.com/Franz-Raven/IT342-Sanchez-BidWarsOnline/commit/19a5ef398aca2d17a9300f616944c7cbbf661843</w:t>
         </w:r>
       </w:hyperlink>
     </w:p>
@@ -369,6 +369,250 @@
           <w:b/>
           <w:bCs/>
         </w:rPr>
+        <w:t xml:space="preserve">B. </w:t>
+      </w:r>
+      <w:r>
+        <w:rPr>
+          <w:b/>
+          <w:bCs/>
+        </w:rPr>
+        <w:t>Mines Game</w:t>
+      </w:r>
+    </w:p>
+    <w:p>
+      <w:pPr>
+        <w:rPr>
+          <w:b/>
+          <w:bCs/>
+        </w:rPr>
+      </w:pPr>
+      <w:r>
+        <w:drawing>
+          <wp:inline distT="0" distB="0" distL="0" distR="0" wp14:anchorId="752E1E65" wp14:editId="776F886C">
+            <wp:extent cx="5943600" cy="2867660"/>
+            <wp:effectExtent l="0" t="0" r="0" b="8890"/>
+            <wp:docPr id="858539526" name="Picture 1"/>
+            <wp:cNvGraphicFramePr>
+              <a:graphicFrameLocks xmlns:a="http://schemas.openxmlformats.org/drawingml/2006/main" noChangeAspect="1"/>
+            </wp:cNvGraphicFramePr>
+            <a:graphic xmlns:a="http://schemas.openxmlformats.org/drawingml/2006/main">
+              <a:graphicData uri="http://schemas.openxmlformats.org/drawingml/2006/picture">
+                <pic:pic xmlns:pic="http://schemas.openxmlformats.org/drawingml/2006/picture">
+                  <pic:nvPicPr>
+                    <pic:cNvPr id="858539526" name=""/>
+                    <pic:cNvPicPr/>
+                  </pic:nvPicPr>
+                  <pic:blipFill>
+                    <a:blip r:embed="rId9"/>
+                    <a:stretch>
+                      <a:fillRect/>
+                    </a:stretch>
+                  </pic:blipFill>
+                  <pic:spPr>
+                    <a:xfrm>
+                      <a:off x="0" y="0"/>
+                      <a:ext cx="5943600" cy="2867660"/>
+                    </a:xfrm>
+                    <a:prstGeom prst="rect">
+                      <a:avLst/>
+                    </a:prstGeom>
+                  </pic:spPr>
+                </pic:pic>
+              </a:graphicData>
+            </a:graphic>
+          </wp:inline>
+        </w:drawing>
+      </w:r>
+    </w:p>
+    <w:p>
+      <w:r>
+        <w:t>User Interface for playing the mines game</w:t>
+      </w:r>
+    </w:p>
+    <w:p>
+      <w:r>
+        <w:lastRenderedPageBreak/>
+        <w:drawing>
+          <wp:inline distT="0" distB="0" distL="0" distR="0" wp14:anchorId="4CF0E1FD" wp14:editId="41FB329E">
+            <wp:extent cx="5943600" cy="3187065"/>
+            <wp:effectExtent l="0" t="0" r="0" b="0"/>
+            <wp:docPr id="1570941131" name="Picture 1"/>
+            <wp:cNvGraphicFramePr>
+              <a:graphicFrameLocks xmlns:a="http://schemas.openxmlformats.org/drawingml/2006/main" noChangeAspect="1"/>
+            </wp:cNvGraphicFramePr>
+            <a:graphic xmlns:a="http://schemas.openxmlformats.org/drawingml/2006/main">
+              <a:graphicData uri="http://schemas.openxmlformats.org/drawingml/2006/picture">
+                <pic:pic xmlns:pic="http://schemas.openxmlformats.org/drawingml/2006/picture">
+                  <pic:nvPicPr>
+                    <pic:cNvPr id="1570941131" name=""/>
+                    <pic:cNvPicPr/>
+                  </pic:nvPicPr>
+                  <pic:blipFill>
+                    <a:blip r:embed="rId10"/>
+                    <a:stretch>
+                      <a:fillRect/>
+                    </a:stretch>
+                  </pic:blipFill>
+                  <pic:spPr>
+                    <a:xfrm>
+                      <a:off x="0" y="0"/>
+                      <a:ext cx="5943600" cy="3187065"/>
+                    </a:xfrm>
+                    <a:prstGeom prst="rect">
+                      <a:avLst/>
+                    </a:prstGeom>
+                  </pic:spPr>
+                </pic:pic>
+              </a:graphicData>
+            </a:graphic>
+          </wp:inline>
+        </w:drawing>
+      </w:r>
+    </w:p>
+    <w:p>
+      <w:r>
+        <w:t>Database record for the mines game</w:t>
+      </w:r>
+    </w:p>
+    <w:p>
+      <w:pPr>
+        <w:rPr>
+          <w:b/>
+          <w:bCs/>
+        </w:rPr>
+      </w:pPr>
+      <w:r>
+        <w:rPr>
+          <w:b/>
+          <w:bCs/>
+        </w:rPr>
+        <w:t xml:space="preserve">C. </w:t>
+      </w:r>
+      <w:r>
+        <w:rPr>
+          <w:b/>
+          <w:bCs/>
+        </w:rPr>
+        <w:t>Hi-Lo game</w:t>
+      </w:r>
+    </w:p>
+    <w:p>
+      <w:pPr>
+        <w:rPr>
+          <w:b/>
+          <w:bCs/>
+        </w:rPr>
+      </w:pPr>
+      <w:r>
+        <w:rPr>
+          <w:b/>
+          <w:bCs/>
+        </w:rPr>
+        <w:drawing>
+          <wp:inline distT="0" distB="0" distL="0" distR="0" wp14:anchorId="0E1B1BB6" wp14:editId="79427470">
+            <wp:extent cx="5943600" cy="3180715"/>
+            <wp:effectExtent l="0" t="0" r="0" b="635"/>
+            <wp:docPr id="2093188261" name="Picture 1"/>
+            <wp:cNvGraphicFramePr>
+              <a:graphicFrameLocks xmlns:a="http://schemas.openxmlformats.org/drawingml/2006/main" noChangeAspect="1"/>
+            </wp:cNvGraphicFramePr>
+            <a:graphic xmlns:a="http://schemas.openxmlformats.org/drawingml/2006/main">
+              <a:graphicData uri="http://schemas.openxmlformats.org/drawingml/2006/picture">
+                <pic:pic xmlns:pic="http://schemas.openxmlformats.org/drawingml/2006/picture">
+                  <pic:nvPicPr>
+                    <pic:cNvPr id="2093188261" name=""/>
+                    <pic:cNvPicPr/>
+                  </pic:nvPicPr>
+                  <pic:blipFill>
+                    <a:blip r:embed="rId11"/>
+                    <a:stretch>
+                      <a:fillRect/>
+                    </a:stretch>
+                  </pic:blipFill>
+                  <pic:spPr>
+                    <a:xfrm>
+                      <a:off x="0" y="0"/>
+                      <a:ext cx="5943600" cy="3180715"/>
+                    </a:xfrm>
+                    <a:prstGeom prst="rect">
+                      <a:avLst/>
+                    </a:prstGeom>
+                  </pic:spPr>
+                </pic:pic>
+              </a:graphicData>
+            </a:graphic>
+          </wp:inline>
+        </w:drawing>
+      </w:r>
+    </w:p>
+    <w:p>
+      <w:r>
+        <w:t xml:space="preserve">User Interface for playing the </w:t>
+      </w:r>
+      <w:r>
+        <w:t>hi-lo</w:t>
+      </w:r>
+      <w:r>
+        <w:t xml:space="preserve"> game</w:t>
+      </w:r>
+    </w:p>
+    <w:p>
+      <w:r>
+        <w:lastRenderedPageBreak/>
+        <w:drawing>
+          <wp:inline distT="0" distB="0" distL="0" distR="0" wp14:anchorId="6D70DF5A" wp14:editId="5FE3AB9B">
+            <wp:extent cx="5943600" cy="3183890"/>
+            <wp:effectExtent l="0" t="0" r="0" b="0"/>
+            <wp:docPr id="1877626190" name="Picture 1"/>
+            <wp:cNvGraphicFramePr>
+              <a:graphicFrameLocks xmlns:a="http://schemas.openxmlformats.org/drawingml/2006/main" noChangeAspect="1"/>
+            </wp:cNvGraphicFramePr>
+            <a:graphic xmlns:a="http://schemas.openxmlformats.org/drawingml/2006/main">
+              <a:graphicData uri="http://schemas.openxmlformats.org/drawingml/2006/picture">
+                <pic:pic xmlns:pic="http://schemas.openxmlformats.org/drawingml/2006/picture">
+                  <pic:nvPicPr>
+                    <pic:cNvPr id="1877626190" name=""/>
+                    <pic:cNvPicPr/>
+                  </pic:nvPicPr>
+                  <pic:blipFill>
+                    <a:blip r:embed="rId12"/>
+                    <a:stretch>
+                      <a:fillRect/>
+                    </a:stretch>
+                  </pic:blipFill>
+                  <pic:spPr>
+                    <a:xfrm>
+                      <a:off x="0" y="0"/>
+                      <a:ext cx="5943600" cy="3183890"/>
+                    </a:xfrm>
+                    <a:prstGeom prst="rect">
+                      <a:avLst/>
+                    </a:prstGeom>
+                  </pic:spPr>
+                </pic:pic>
+              </a:graphicData>
+            </a:graphic>
+          </wp:inline>
+        </w:drawing>
+      </w:r>
+    </w:p>
+    <w:p>
+      <w:r>
+        <w:t>Database record for the hi-lo game</w:t>
+      </w:r>
+    </w:p>
+    <w:p>
+      <w:pPr>
+        <w:rPr>
+          <w:b/>
+          <w:bCs/>
+        </w:rPr>
+      </w:pPr>
+      <w:r>
+        <w:rPr>
+          <w:b/>
+          <w:bCs/>
+        </w:rPr>
         <w:t>3. Project Summary</w:t>
       </w:r>
     </w:p>
@@ -384,6 +628,50 @@
           <w:b/>
           <w:bCs/>
         </w:rPr>
+        <w:t xml:space="preserve">How the </w:t>
+      </w:r>
+      <w:proofErr w:type="spellStart"/>
+      <w:r>
+        <w:rPr>
+          <w:b/>
+          <w:bCs/>
+        </w:rPr>
+        <w:t>Plinko</w:t>
+      </w:r>
+      <w:proofErr w:type="spellEnd"/>
+      <w:r>
+        <w:rPr>
+          <w:b/>
+          <w:bCs/>
+        </w:rPr>
+        <w:t xml:space="preserve"> Game Works </w:t>
+      </w:r>
+    </w:p>
+    <w:p>
+      <w:r>
+        <w:t xml:space="preserve">The </w:t>
+      </w:r>
+      <w:proofErr w:type="spellStart"/>
+      <w:r>
+        <w:t>Plinko</w:t>
+      </w:r>
+      <w:proofErr w:type="spellEnd"/>
+      <w:r>
+        <w:t xml:space="preserve"> feature is a physics-simulated drop game where users wager on where a ball will land among varying multiplier buckets. The process begins when the user selects their bet amount, risk level (Low, Medium, High), and number of rows via the Next.js interface. Upon clicking "Drop Ball," the Spring Boot backend immediately deducts the wager and calculates a Provably Fair outcome. The server transmits this outcome to the client, which then triggers the visual animation of the ball dropping into the predetermined bucket. The user's wallet is updated in real-time without requiring a page refresh.</w:t>
+      </w:r>
+    </w:p>
+    <w:p>
+      <w:pPr>
+        <w:rPr>
+          <w:b/>
+          <w:bCs/>
+        </w:rPr>
+      </w:pPr>
+      <w:r>
+        <w:rPr>
+          <w:b/>
+          <w:bCs/>
+        </w:rPr>
         <w:t xml:space="preserve">How the Mines Game Works </w:t>
       </w:r>
     </w:p>
@@ -404,12 +692,51 @@
           <w:b/>
           <w:bCs/>
         </w:rPr>
+        <w:t xml:space="preserve">How the </w:t>
+      </w:r>
+      <w:r>
+        <w:rPr>
+          <w:b/>
+          <w:bCs/>
+        </w:rPr>
+        <w:t>Hi-Lo</w:t>
+      </w:r>
+      <w:r>
+        <w:rPr>
+          <w:b/>
+          <w:bCs/>
+        </w:rPr>
+        <w:t xml:space="preserve"> Game Works </w:t>
+      </w:r>
+    </w:p>
+    <w:p>
+      <w:r>
+        <w:t xml:space="preserve">The Hi-Lo feature is a predictive card game built on an infinite-deck probability model. After placing an initial bet, the user is dealt a face-up card (ranks 2 through Ace). The user must predict whether </w:t>
+      </w:r>
+      <w:r>
+        <w:lastRenderedPageBreak/>
+        <w:t>the next drawn card will be strictly "Higher" or "Lower." If correct, the potential win compounds based on dynamic odds and a scaling streak bonus (10% per consecutive win). Ties (drawing the exact same rank) result in a house win. Because the game utilizes a snowballing pot, the server maintains an active session state between guesses. The user can choose to "Collect" at any point, or the system will enforce an auto-cashout if the maximum payout ceiling is reached.</w:t>
+      </w:r>
+    </w:p>
+    <w:p/>
+    <w:p>
+      <w:pPr>
+        <w:rPr>
+          <w:b/>
+          <w:bCs/>
+        </w:rPr>
+      </w:pPr>
+      <w:r>
+        <w:rPr>
+          <w:b/>
+          <w:bCs/>
+        </w:rPr>
         <w:t xml:space="preserve">Inputs and Validations Used </w:t>
       </w:r>
     </w:p>
     <w:p>
       <w:r>
-        <w:t xml:space="preserve">The system captures the user's </w:t>
+        <w:t>Across all three games, the system captures standard financial inputs (</w:t>
       </w:r>
       <w:proofErr w:type="spellStart"/>
       <w:r>
@@ -417,15 +744,23 @@
       </w:r>
       <w:proofErr w:type="spellEnd"/>
       <w:r>
-        <w:t xml:space="preserve">, the </w:t>
+        <w:t xml:space="preserve">) and game-specific configurations (e.g., </w:t>
       </w:r>
       <w:proofErr w:type="spellStart"/>
       <w:r>
+        <w:t>riskLevel</w:t>
+      </w:r>
+      <w:proofErr w:type="spellEnd"/>
+      <w:r>
+        <w:t xml:space="preserve">, </w:t>
+      </w:r>
+      <w:proofErr w:type="spellStart"/>
+      <w:r>
         <w:t>minesCount</w:t>
       </w:r>
       <w:proofErr w:type="spellEnd"/>
       <w:r>
-        <w:t xml:space="preserve">, and the specific </w:t>
+        <w:t xml:space="preserve">, </w:t>
       </w:r>
       <w:proofErr w:type="spellStart"/>
       <w:r>
@@ -433,34 +768,224 @@
       </w:r>
       <w:proofErr w:type="spellEnd"/>
       <w:r>
-        <w:t xml:space="preserve"> (0-24) during gameplay. The backend rigorously validates these inputs by ensuring the user has a sufficient wallet balance before deducting the </w:t>
-      </w:r>
-      <w:proofErr w:type="gramStart"/>
-      <w:r>
-        <w:t>bet ,</w:t>
-      </w:r>
-      <w:proofErr w:type="gramEnd"/>
-      <w:r>
-        <w:t xml:space="preserve"> restricting the </w:t>
+        <w:t>, or guess). The backend rigorously validates these inputs by verifying the user has a sufficient wallet balance before any game logic executes. It also strictly enforces game boundaries (e.g., Mines count must be 1-24, tile clicks cannot be repeated, and the session status must be ACTIVE before processing a new card guess).</w:t>
+      </w:r>
+    </w:p>
+    <w:p>
+      <w:pPr>
+        <w:rPr>
+          <w:b/>
+          <w:bCs/>
+        </w:rPr>
+      </w:pPr>
+      <w:r>
+        <w:rPr>
+          <w:b/>
+          <w:bCs/>
+        </w:rPr>
+        <w:t>API Integration Used</w:t>
+      </w:r>
+    </w:p>
+    <w:p>
+      <w:r>
+        <w:t xml:space="preserve">This project utilizes a robust mix of REST APIs and </w:t>
       </w:r>
       <w:proofErr w:type="spellStart"/>
       <w:r>
-        <w:t>minesCount</w:t>
+        <w:t>WebSockets</w:t>
       </w:r>
       <w:proofErr w:type="spellEnd"/>
       <w:r>
-        <w:t xml:space="preserve"> strictly between 1 and 24, and verifying that a submitted </w:t>
+        <w:t xml:space="preserve"> for secure, low-latency execution:</w:t>
+      </w:r>
+    </w:p>
+    <w:p>
+      <w:pPr>
+        <w:numPr>
+          <w:ilvl w:val="0"/>
+          <w:numId w:val="3"/>
+        </w:numPr>
+      </w:pPr>
+      <w:r>
+        <w:rPr>
+          <w:b/>
+          <w:bCs/>
+        </w:rPr>
+        <w:t>RESTful API:</w:t>
+      </w:r>
+      <w:r>
+        <w:t xml:space="preserve"> Game initialization and stateless actions are handled via standard HTTP POST requests (e.g., /</w:t>
       </w:r>
       <w:proofErr w:type="spellStart"/>
       <w:r>
-        <w:t>tileIndex</w:t>
+        <w:t>api</w:t>
       </w:r>
       <w:proofErr w:type="spellEnd"/>
       <w:r>
-        <w:t xml:space="preserve"> has not already been clicked in the active session.</w:t>
-      </w:r>
-    </w:p>
-    <w:p/>
+        <w:t>/games/bet).</w:t>
+      </w:r>
+    </w:p>
+    <w:p>
+      <w:pPr>
+        <w:numPr>
+          <w:ilvl w:val="0"/>
+          <w:numId w:val="3"/>
+        </w:numPr>
+      </w:pPr>
+      <w:r>
+        <w:rPr>
+          <w:b/>
+          <w:bCs/>
+        </w:rPr>
+        <w:t>Real-time Capabilities:</w:t>
+      </w:r>
+      <w:r>
+        <w:t xml:space="preserve"> Game execution, intermediate guessing, and balance settlements utilize STOMP </w:t>
+      </w:r>
+      <w:proofErr w:type="spellStart"/>
+      <w:r>
+        <w:t>WebSockets</w:t>
+      </w:r>
+      <w:proofErr w:type="spellEnd"/>
+      <w:r>
+        <w:t xml:space="preserve"> (/</w:t>
+      </w:r>
+      <w:proofErr w:type="spellStart"/>
+      <w:r>
+        <w:t>ws</w:t>
+      </w:r>
+      <w:proofErr w:type="spellEnd"/>
+      <w:r>
+        <w:t>-gaming). This bidirectional communication ensures message delivery under 100ms, allowing for instant UI animations and wallet updates.</w:t>
+      </w:r>
+    </w:p>
+    <w:p>
+      <w:pPr>
+        <w:rPr>
+          <w:b/>
+          <w:bCs/>
+        </w:rPr>
+      </w:pPr>
+      <w:r>
+        <w:rPr>
+          <w:b/>
+          <w:bCs/>
+        </w:rPr>
+        <w:t>Database Tables Involved</w:t>
+      </w:r>
+    </w:p>
+    <w:p>
+      <w:pPr>
+        <w:numPr>
+          <w:ilvl w:val="0"/>
+          <w:numId w:val="3"/>
+        </w:numPr>
+      </w:pPr>
+      <w:r>
+        <w:rPr>
+          <w:b/>
+          <w:bCs/>
+        </w:rPr>
+        <w:t>Wallet</w:t>
+      </w:r>
+      <w:r>
+        <w:t>: Ensures ACID-compliant deductions of the initial bet and atomic crediting of final payouts.</w:t>
+      </w:r>
+    </w:p>
+    <w:p>
+      <w:pPr>
+        <w:numPr>
+          <w:ilvl w:val="0"/>
+          <w:numId w:val="3"/>
+        </w:numPr>
+      </w:pPr>
+      <w:proofErr w:type="spellStart"/>
+      <w:r>
+        <w:rPr>
+          <w:b/>
+          <w:bCs/>
+        </w:rPr>
+        <w:t>Bet_Record</w:t>
+      </w:r>
+      <w:proofErr w:type="spellEnd"/>
+      <w:r>
+        <w:t xml:space="preserve">: Stores the permanent audit trail of every completed round, logging the </w:t>
+      </w:r>
+      <w:proofErr w:type="spellStart"/>
+      <w:r>
+        <w:t>user_id</w:t>
+      </w:r>
+      <w:proofErr w:type="spellEnd"/>
+      <w:r>
+        <w:t xml:space="preserve">, </w:t>
+      </w:r>
+      <w:proofErr w:type="spellStart"/>
+      <w:r>
+        <w:t>game_type</w:t>
+      </w:r>
+      <w:proofErr w:type="spellEnd"/>
+      <w:r>
+        <w:t xml:space="preserve">, </w:t>
+      </w:r>
+      <w:proofErr w:type="spellStart"/>
+      <w:r>
+        <w:t>bet_amount</w:t>
+      </w:r>
+      <w:proofErr w:type="spellEnd"/>
+      <w:r>
+        <w:t xml:space="preserve">, multiplier, </w:t>
+      </w:r>
+      <w:proofErr w:type="spellStart"/>
+      <w:r>
+        <w:t>payout_amount</w:t>
+      </w:r>
+      <w:proofErr w:type="spellEnd"/>
+      <w:r>
+        <w:t xml:space="preserve">, and a JSON snapshot of the final </w:t>
+      </w:r>
+      <w:proofErr w:type="spellStart"/>
+      <w:r>
+        <w:t>game_data</w:t>
+      </w:r>
+      <w:proofErr w:type="spellEnd"/>
+      <w:r>
+        <w:t xml:space="preserve"> (e.g., the final </w:t>
+      </w:r>
+      <w:proofErr w:type="spellStart"/>
+      <w:r>
+        <w:t>Plinko</w:t>
+      </w:r>
+      <w:proofErr w:type="spellEnd"/>
+      <w:r>
+        <w:t xml:space="preserve"> bucket, the revealed Mines grid, or the final Hi-Lo streak).</w:t>
+      </w:r>
+    </w:p>
+    <w:p>
+      <w:pPr>
+        <w:numPr>
+          <w:ilvl w:val="0"/>
+          <w:numId w:val="3"/>
+        </w:numPr>
+      </w:pPr>
+      <w:r>
+        <w:rPr>
+          <w:b/>
+          <w:bCs/>
+        </w:rPr>
+        <w:t>Session Management</w:t>
+      </w:r>
+      <w:r>
+        <w:t xml:space="preserve">: Active game states (like a multi-round Hi-Lo pot or a hidden Mines grid) are tracked in dedicated active-session entities before being finalized and logged to the permanent </w:t>
+      </w:r>
+      <w:proofErr w:type="spellStart"/>
+      <w:r>
+        <w:t>Bet_Record</w:t>
+      </w:r>
+      <w:proofErr w:type="spellEnd"/>
+      <w:r>
+        <w:t xml:space="preserve"> ledger.</w:t>
+      </w:r>
+    </w:p>
     <w:sectPr>
       <w:pgSz w:w="12240" w:h="15840"/>
       <w:pgMar w:top="1440" w:right="1440" w:bottom="1440" w:left="1440" w:header="708" w:footer="708" w:gutter="0"/>
@@ -771,11 +1296,163 @@
       </w:rPr>
     </w:lvl>
   </w:abstractNum>
+  <w:abstractNum w:abstractNumId="2" w15:restartNumberingAfterBreak="0">
+    <w:nsid w:val="622D3394"/>
+    <w:multiLevelType w:val="multilevel"/>
+    <w:tmpl w:val="EEBC5D24"/>
+    <w:lvl w:ilvl="0">
+      <w:start w:val="1"/>
+      <w:numFmt w:val="bullet"/>
+      <w:lvlText w:val=""/>
+      <w:lvlJc w:val="left"/>
+      <w:pPr>
+        <w:tabs>
+          <w:tab w:val="num" w:pos="720"/>
+        </w:tabs>
+        <w:ind w:left="720" w:hanging="360"/>
+      </w:pPr>
+      <w:rPr>
+        <w:rFonts w:ascii="Symbol" w:hAnsi="Symbol" w:hint="default"/>
+        <w:sz w:val="20"/>
+      </w:rPr>
+    </w:lvl>
+    <w:lvl w:ilvl="1" w:tentative="1">
+      <w:start w:val="1"/>
+      <w:numFmt w:val="bullet"/>
+      <w:lvlText w:val="o"/>
+      <w:lvlJc w:val="left"/>
+      <w:pPr>
+        <w:tabs>
+          <w:tab w:val="num" w:pos="1440"/>
+        </w:tabs>
+        <w:ind w:left="1440" w:hanging="360"/>
+      </w:pPr>
+      <w:rPr>
+        <w:rFonts w:ascii="Courier New" w:hAnsi="Courier New" w:hint="default"/>
+        <w:sz w:val="20"/>
+      </w:rPr>
+    </w:lvl>
+    <w:lvl w:ilvl="2" w:tentative="1">
+      <w:start w:val="1"/>
+      <w:numFmt w:val="bullet"/>
+      <w:lvlText w:val=""/>
+      <w:lvlJc w:val="left"/>
+      <w:pPr>
+        <w:tabs>
+          <w:tab w:val="num" w:pos="2160"/>
+        </w:tabs>
+        <w:ind w:left="2160" w:hanging="360"/>
+      </w:pPr>
+      <w:rPr>
+        <w:rFonts w:ascii="Wingdings" w:hAnsi="Wingdings" w:hint="default"/>
+        <w:sz w:val="20"/>
+      </w:rPr>
+    </w:lvl>
+    <w:lvl w:ilvl="3" w:tentative="1">
+      <w:start w:val="1"/>
+      <w:numFmt w:val="bullet"/>
+      <w:lvlText w:val=""/>
+      <w:lvlJc w:val="left"/>
+      <w:pPr>
+        <w:tabs>
+          <w:tab w:val="num" w:pos="2880"/>
+        </w:tabs>
+        <w:ind w:left="2880" w:hanging="360"/>
+      </w:pPr>
+      <w:rPr>
+        <w:rFonts w:ascii="Wingdings" w:hAnsi="Wingdings" w:hint="default"/>
+        <w:sz w:val="20"/>
+      </w:rPr>
+    </w:lvl>
+    <w:lvl w:ilvl="4" w:tentative="1">
+      <w:start w:val="1"/>
+      <w:numFmt w:val="bullet"/>
+      <w:lvlText w:val=""/>
+      <w:lvlJc w:val="left"/>
+      <w:pPr>
+        <w:tabs>
+          <w:tab w:val="num" w:pos="3600"/>
+        </w:tabs>
+        <w:ind w:left="3600" w:hanging="360"/>
+      </w:pPr>
+      <w:rPr>
+        <w:rFonts w:ascii="Wingdings" w:hAnsi="Wingdings" w:hint="default"/>
+        <w:sz w:val="20"/>
+      </w:rPr>
+    </w:lvl>
+    <w:lvl w:ilvl="5" w:tentative="1">
+      <w:start w:val="1"/>
+      <w:numFmt w:val="bullet"/>
+      <w:lvlText w:val=""/>
+      <w:lvlJc w:val="left"/>
+      <w:pPr>
+        <w:tabs>
+          <w:tab w:val="num" w:pos="4320"/>
+        </w:tabs>
+        <w:ind w:left="4320" w:hanging="360"/>
+      </w:pPr>
+      <w:rPr>
+        <w:rFonts w:ascii="Wingdings" w:hAnsi="Wingdings" w:hint="default"/>
+        <w:sz w:val="20"/>
+      </w:rPr>
+    </w:lvl>
+    <w:lvl w:ilvl="6" w:tentative="1">
+      <w:start w:val="1"/>
+      <w:numFmt w:val="bullet"/>
+      <w:lvlText w:val=""/>
+      <w:lvlJc w:val="left"/>
+      <w:pPr>
+        <w:tabs>
+          <w:tab w:val="num" w:pos="5040"/>
+        </w:tabs>
+        <w:ind w:left="5040" w:hanging="360"/>
+      </w:pPr>
+      <w:rPr>
+        <w:rFonts w:ascii="Wingdings" w:hAnsi="Wingdings" w:hint="default"/>
+        <w:sz w:val="20"/>
+      </w:rPr>
+    </w:lvl>
+    <w:lvl w:ilvl="7" w:tentative="1">
+      <w:start w:val="1"/>
+      <w:numFmt w:val="bullet"/>
+      <w:lvlText w:val=""/>
+      <w:lvlJc w:val="left"/>
+      <w:pPr>
+        <w:tabs>
+          <w:tab w:val="num" w:pos="5760"/>
+        </w:tabs>
+        <w:ind w:left="5760" w:hanging="360"/>
+      </w:pPr>
+      <w:rPr>
+        <w:rFonts w:ascii="Wingdings" w:hAnsi="Wingdings" w:hint="default"/>
+        <w:sz w:val="20"/>
+      </w:rPr>
+    </w:lvl>
+    <w:lvl w:ilvl="8" w:tentative="1">
+      <w:start w:val="1"/>
+      <w:numFmt w:val="bullet"/>
+      <w:lvlText w:val=""/>
+      <w:lvlJc w:val="left"/>
+      <w:pPr>
+        <w:tabs>
+          <w:tab w:val="num" w:pos="6480"/>
+        </w:tabs>
+        <w:ind w:left="6480" w:hanging="360"/>
+      </w:pPr>
+      <w:rPr>
+        <w:rFonts w:ascii="Wingdings" w:hAnsi="Wingdings" w:hint="default"/>
+        <w:sz w:val="20"/>
+      </w:rPr>
+    </w:lvl>
+  </w:abstractNum>
   <w:num w:numId="1" w16cid:durableId="1172375292">
     <w:abstractNumId w:val="1"/>
   </w:num>
   <w:num w:numId="2" w16cid:durableId="590352915">
     <w:abstractNumId w:val="0"/>
+  </w:num>
+  <w:num w:numId="3" w16cid:durableId="1193764272">
+    <w:abstractNumId w:val="2"/>
   </w:num>
 </w:numbering>
 </file>
@@ -1180,6 +1857,7 @@
   <w:style w:type="paragraph" w:default="1" w:styleId="Normal">
     <w:name w:val="Normal"/>
     <w:qFormat/>
+    <w:rsid w:val="00C22BAD"/>
   </w:style>
   <w:style w:type="paragraph" w:styleId="Heading1">
     <w:name w:val="heading 1"/>

</xml_diff>